<commit_message>
docs(sync): record 3.50.2 production browser acceptance
</commit_message>
<xml_diff>
--- a/jackyun-portal/docs/sync-writing-3.50.2-20261027.docx
+++ b/jackyun-portal/docs/sync-writing-3.50.2-20261027.docx
@@ -164,7 +164,15 @@
         <w:spacing w:after="140" w:line="290"/>
       </w:pPr>
       <w:r>
-        <w:t xml:space="preserve">本机候选使用生产构建、真实认证和 Azure 后端尝试复测，但登录后陷入 localhost 重定向循环，未进入同步请求，因此不记为端到端通过。未修改认证逻辑或索取额外凭据。发布后必须在生产配置下复测真实页面往返，并记录实际部署 SHA、READY 与健康检查。</w:t>
+        <w:t xml:space="preserve">本机候选曾因 localhost 登录重定向循环未进入同步，不记为通过。随后 main 提交 3ae26df9259aaf86df1dfe474d6739dd873ddba4 已在生产域名 jackyun.top 部署 READY，部署 ID 为 dpl_4xoUE18AvVuJt2oYTmHvY8qbBrtD。Portal 健康端点 HTTP 200；Azure 健康端点 HTTP 200，版本 3.12.0、协议 5、Gzip。未修改认证逻辑或索取额外凭据。</w:t>
+      </w:r>
+    </w:p>
+    <w:p>
+      <w:pPr>
+        <w:spacing w:after="140" w:line="290"/>
+      </w:pPr>
+      <w:r>
+        <w:t xml:space="preserve">生产真实页面验收通过：专用账号登录后新建 IELTS 写作草稿，本机保存成功，第二个独立 Chrome 浏览器上下文收到相同草稿；v5 operations、receipts、records 和 changes 均观察到 HTTP 200，页面 JS 异常为零。1440 和 390 宽度下同步图标为 40 像素，恢复副本浮层不存在。一次旧 v2 读取返回 503 后后续请求恢复，并未阻断最终传递。此项只证明该写作场景，不等同所有业务和所有故障验收。</w:t>
       </w:r>
     </w:p>
     <w:p>

</xml_diff>